<commit_message>
Fix page numbering, appendix letters, and page breaks
- PDF: Move \pagenumbering{roman} before ToC for correct roman numerals
- PDF: Move \appendix before Danksagung for correct A/B/C lettering
- PDF: Use \clearpage before declaration to flush LaTeX floats
- Word: Make appendix sections unnumbered, fix double page breaks
- Word EN: Add page break before abstract
</commit_message>
<xml_diff>
--- a/resources/examples/ex_thesis_word_de.docx
+++ b/resources/examples/ex_thesis_word_de.docx
@@ -5754,11 +5754,6 @@
         <w:br w:type="page"/>
       </w:r>
     </w:p>
-    <w:p>
-      <w:r>
-        <w:br w:type="page"/>
-      </w:r>
-    </w:p>
     <w:bookmarkEnd w:id="77"/>
     <w:bookmarkStart w:id="78" w:name="danksagung"/>
     <w:p>
@@ -5777,6 +5772,11 @@
         <w:t xml:space="preserve">Ich möchte folgenden Personen danken…</w:t>
       </w:r>
     </w:p>
+    <w:p>
+      <w:r>
+        <w:br w:type="page"/>
+      </w:r>
+    </w:p>
     <w:bookmarkEnd w:id="78"/>
     <w:bookmarkStart w:id="85" w:name="anhang"/>
     <w:p>
@@ -5784,15 +5784,6 @@
         <w:pStyle w:val="berschrift1"/>
       </w:pPr>
       <w:r>
-        <w:rPr>
-          <w:rStyle w:val="SectionNumber"/>
-        </w:rPr>
-        <w:t xml:space="preserve">6</w:t>
-      </w:r>
-      <w:r>
-        <w:tab/>
-      </w:r>
-      <w:r>
         <w:t xml:space="preserve">Anhang</w:t>
       </w:r>
     </w:p>
@@ -5817,15 +5808,6 @@
       <w:pPr>
         <w:pStyle w:val="berschrift2"/>
       </w:pPr>
-      <w:r>
-        <w:rPr>
-          <w:rStyle w:val="SectionNumber"/>
-        </w:rPr>
-        <w:t xml:space="preserve">6.1</w:t>
-      </w:r>
-      <w:r>
-        <w:tab/>
-      </w:r>
       <w:r>
         <w:t xml:space="preserve">Abbildungen</w:t>
       </w:r>
@@ -5839,7 +5821,7 @@
           <wp:inline>
             <wp:extent cx="5969000" cy="4775200"/>
             <wp:effectExtent b="0" l="0" r="0" t="0"/>
-            <wp:docPr descr="Abbildung 6.1: Reichweite in der Stadt, gruppiert nach der Anzahl der Zylinder." title="" id="80" name="Picture"/>
+            <wp:docPr descr="Abbildung 5.1: Reichweite in der Stadt, gruppiert nach der Anzahl der Zylinder." title="" id="80" name="Picture"/>
             <a:graphic>
               <a:graphicData uri="http://schemas.openxmlformats.org/drawingml/2006/picture">
                 <pic:pic>
@@ -5884,7 +5866,7 @@
       <w:bookmarkStart w:id="82" w:name="fig:density-plot"/>
       <w:bookmarkEnd w:id="82"/>
       <w:r>
-        <w:t xml:space="preserve">Abbildung 6.1: Reichweite in der Stadt, gruppiert nach der Anzahl der Zylinder.</w:t>
+        <w:t xml:space="preserve">Abbildung 5.1: Reichweite in der Stadt, gruppiert nach der Anzahl der Zylinder.</w:t>
       </w:r>
     </w:p>
     <w:bookmarkEnd w:id="83"/>
@@ -5893,15 +5875,6 @@
       <w:pPr>
         <w:pStyle w:val="berschrift2"/>
       </w:pPr>
-      <w:r>
-        <w:rPr>
-          <w:rStyle w:val="SectionNumber"/>
-        </w:rPr>
-        <w:t xml:space="preserve">6.2</w:t>
-      </w:r>
-      <w:r>
-        <w:tab/>
-      </w:r>
       <w:r>
         <w:t xml:space="preserve">Tabellen</w:t>
       </w:r>

</xml_diff>